<commit_message>
docs: dọn văn phong AI khỏi Software Development Plan (bỏ em dash + 1 câu đối lập thừa)
</commit_message>
<xml_diff>
--- a/docs/PA1_SDP_Sota.docx
+++ b/docs/PA1_SDP_Sota.docx
@@ -528,7 +528,7 @@
           <w:sz w:val="22"/>
           <w:szCs w:val="22"/>
         </w:rPr>
-        <w:t xml:space="preserve">Các bảo tàng hiện nay cần một nền tảng số để tiếp cận công chúng, bán vé và số hóa bộ sưu tập — nhu cầu này đã thể hiện rõ ở Việt Nam: Bảo tàng Chứng tích Chiến tranh (TPHCM) đã triển khai hệ thống bán vé trực tuyến thật (ticket.baotangchungtichchientranh.vn), Bảo tàng Lịch sử TPHCM đang thử nghiệm kho số hóa mở. Tuy nhiên chưa có nền tảng nào giải quyết đầy đủ các nhu cầu này cùng lúc (showcase, tham quan online, đặt vé, lưu niệm, điều hướng giữa nhiều bảo tàng trong cùng 1 cụm).</w:t>
+        <w:t xml:space="preserve">Các bảo tàng hiện nay cần một nền tảng số để tiếp cận công chúng, bán vé và số hóa bộ sưu tập. Nhu cầu này đã thể hiện rõ ở Việt Nam: Bảo tàng Chứng tích Chiến tranh (TPHCM) đã triển khai hệ thống bán vé trực tuyến thật (ticket.baotangchungtichchientranh.vn), Bảo tàng Lịch sử TPHCM đang thử nghiệm kho số hóa mở. Tuy nhiên chưa có nền tảng nào giải quyết đầy đủ các nhu cầu này cùng lúc (showcase, tham quan online, đặt vé, lưu niệm, điều hướng giữa nhiều bảo tàng trong cùng 1 cụm).</w:t>
       </w:r>
     </w:p>
     <w:p>
@@ -541,7 +541,7 @@
           <w:sz w:val="22"/>
           <w:szCs w:val="22"/>
         </w:rPr>
-        <w:t xml:space="preserve">Sota là nền tảng web cho cụm bảo tàng, giải quyết đúng bài toán nghiệp vụ CRUD thật của ngành bảo tàng (quản lý hiện vật, triển lãm, vé, đơn hàng, người dùng) thay vì chỉ là một trang trưng bày tĩnh. Vì các bảo tàng Việt Nam hiện chưa công khai dữ liệu số hóa qua API (đã xác minh qua khảo sát thực tế), nhóm dùng Smithsonian Open Access API (dữ liệu thật, cấp phép CC0, 21 bảo tàng tại Washington D.C., hơn 5,1 triệu hiện vật số hóa) để triển khai và minh chứng đầy đủ các tính năng trên một cụm bảo tàng có thật.</w:t>
+        <w:t xml:space="preserve">Sota là nền tảng web cho cụm bảo tàng, giải quyết đúng bài toán nghiệp vụ CRUD thật của ngành bảo tàng (quản lý hiện vật, triển lãm, vé, đơn hàng, người dùng). Vì các bảo tàng Việt Nam hiện chưa công khai dữ liệu số hóa qua API (đã xác minh qua khảo sát thực tế), nhóm dùng Smithsonian Open Access API (dữ liệu thật, cấp phép CC0, 21 bảo tàng tại Washington D.C., hơn 5,1 triệu hiện vật số hóa) để triển khai và minh chứng đầy đủ các tính năng trên một cụm bảo tàng có thật.</w:t>
       </w:r>
     </w:p>
     <w:p>
@@ -616,7 +616,7 @@
           <w:sz w:val="22"/>
           <w:szCs w:val="22"/>
         </w:rPr>
-        <w:t xml:space="preserve">Ràng buộc ngân sách: toàn bộ dịch vụ dùng gói miễn phí (Supabase free tier, Stripe test mode, Vercel Hobby) — không phát sinh chi phí.</w:t>
+        <w:t xml:space="preserve">Ràng buộc ngân sách: toàn bộ dịch vụ dùng gói miễn phí (Supabase free tier, Stripe test mode, Vercel Hobby), không phát sinh chi phí.</w:t>
       </w:r>
     </w:p>
     <w:p>
@@ -1592,7 +1592,7 @@
           <w:sz w:val="22"/>
           <w:szCs w:val="22"/>
         </w:rPr>
-        <w:t xml:space="preserve">Nhóm gồm 5 thành viên, không phân cấp quản lý trung gian — Trưởng nhóm (Võ Hoàng Phúc) chịu trách nhiệm điều phối chung và tổng hợp tiến độ, mỗi thành viên còn lại tự quản lý module mình phụ trách theo nguyên tắc feature-first (mỗi module 1 thư mục route riêng, giảm xung đột merge — xem CONTRIBUTING.md). Giao tiếp nhóm qua công cụ đã đăng ký ở PA0 (Slack/kênh dự án, board Jira/Trello, repository GitHub chung).</w:t>
+        <w:t xml:space="preserve">Nhóm gồm 5 thành viên, không phân cấp quản lý trung gian. Trưởng nhóm (Võ Hoàng Phúc) chịu trách nhiệm điều phối chung và tổng hợp tiến độ, mỗi thành viên còn lại tự quản lý module mình phụ trách theo nguyên tắc feature-first (mỗi module 1 thư mục route riêng, giảm xung đột merge, xem CONTRIBUTING.md). Giao tiếp nhóm qua công cụ đã đăng ký ở PA0 (Slack/kênh dự án, board Jira/Trello, repository GitHub chung).</w:t>
       </w:r>
     </w:p>
     <w:p>
@@ -2458,7 +2458,7 @@
           <w:sz w:val="22"/>
           <w:szCs w:val="22"/>
         </w:rPr>
-        <w:t xml:space="preserve">Release 0 (đã hoàn tất, 15/10/2026): khung dự án rỗng, deploy thành công lên spaceoftheart.vercel.app — chưa có tính năng nghiệp vụ.</w:t>
+        <w:t xml:space="preserve">Release 0 (đã hoàn tất, 15/10/2026): khung dự án rỗng, deploy thành công lên spaceoftheart.vercel.app, chưa có tính năng nghiệp vụ.</w:t>
       </w:r>
     </w:p>
     <w:p>
@@ -3546,7 +3546,7 @@
           <w:sz w:val="22"/>
           <w:szCs w:val="22"/>
         </w:rPr>
-        <w:t xml:space="preserve">5 thành viên, phân công cố định theo module trong suốt dự án (xem mục 3.2) — không cần tuyển thêm nhân lực. Không yêu cầu đào tạo đặc biệt: toàn bộ công nghệ sử dụng (Next.js, TypeScript, Prisma, Supabase, Stripe) đều có tài liệu hướng dẫn công khai đầy đủ, và nhóm đã tự thiết lập xong môi trường phát triển (xác nhận qua `npm run build` chạy sạch).</w:t>
+        <w:t xml:space="preserve">5 thành viên, phân công cố định theo module trong suốt dự án (xem mục 3.2), không cần tuyển thêm nhân lực. Không yêu cầu đào tạo đặc biệt: toàn bộ công nghệ sử dụng (Next.js, TypeScript, Prisma, Supabase, Stripe) đều có tài liệu hướng dẫn công khai đầy đủ, và nhóm đã tự thiết lập xong môi trường phát triển (xác nhận qua `npm run build` chạy sạch).</w:t>
       </w:r>
     </w:p>
     <w:p>
@@ -3575,7 +3575,7 @@
           <w:sz w:val="22"/>
           <w:szCs w:val="22"/>
         </w:rPr>
-        <w:t xml:space="preserve">Yêu cầu hệ thống được ghi nhận trong Vision Document (PA1) và bảng tính năng chi tiết (docs/Bang_tinh_nang.md — 21 tính năng, phân loại MVP/Nâng cao). Thay đổi yêu cầu (nếu có) sẽ được cập nhật trực tiếp vào 2 tài liệu này và ghi lại lý do thay đổi trong docs/Nhat_ky_lam_viec.md — nhật ký làm việc của nhóm, ghi lại mỗi quyết định kèm thời gian, mục đích và cách thực hiện.</w:t>
+        <w:t xml:space="preserve">Yêu cầu hệ thống được ghi nhận trong Vision Document (PA1) và bảng tính năng chi tiết (docs/Bang_tinh_nang.md, 21 tính năng, phân loại MVP/Nâng cao). Thay đổi yêu cầu (nếu có) sẽ được cập nhật trực tiếp vào 2 tài liệu này và ghi lại lý do thay đổi trong docs/Nhat_ky_lam_viec.md, nhật ký làm việc của nhóm ghi lại mỗi quyết định kèm thời gian, mục đích và cách thực hiện.</w:t>
       </w:r>
     </w:p>
     <w:p>
@@ -3799,7 +3799,7 @@
                 <w:sz w:val="20"/>
                 <w:szCs w:val="20"/>
               </w:rPr>
-              <w:t xml:space="preserve">Smithsonian Open Access API có thể giới hạn tốc độ gọi (rate limit) hoặc thay đổi cấu trúc response, làm gián đoạn việc đồng bộ dữ liệu hiện vật — module Hiện vật là nền tảng cho module Triển lãm và Lưu niệm.</w:t>
+              <w:t xml:space="preserve">Smithsonian Open Access API có thể giới hạn tốc độ gọi (rate limit) hoặc thay đổi cấu trúc response, làm gián đoạn việc đồng bộ dữ liệu hiện vật. Module Hiện vật là nền tảng cho module Triển lãm và Lưu niệm.</w:t>
             </w:r>
           </w:p>
         </w:tc>
@@ -3897,7 +3897,7 @@
                 <w:sz w:val="20"/>
                 <w:szCs w:val="20"/>
               </w:rPr>
-              <w:t xml:space="preserve">5 thành viên code song song trên cùng schema CSDL (Prisma) và cùng tích hợp Stripe (module Vé và module Lưu niệm) — dễ xung đột merge hoặc trùng logic.</w:t>
+              <w:t xml:space="preserve">5 thành viên code song song trên cùng schema CSDL (Prisma) và cùng tích hợp Stripe (module Vé và module Lưu niệm), dễ xung đột merge hoặc trùng logic.</w:t>
             </w:r>
           </w:p>
         </w:tc>
@@ -3995,7 +3995,7 @@
                 <w:sz w:val="20"/>
                 <w:szCs w:val="20"/>
               </w:rPr>
-              <w:t xml:space="preserve">Supabase và Stripe ở gói miễn phí có giới hạn tài nguyên (số lượng request, dung lượng CSDL) — có thể ảnh hưởng lúc kiểm thử tải hoặc demo đông người xem cùng lúc.</w:t>
+              <w:t xml:space="preserve">Supabase và Stripe ở gói miễn phí có giới hạn tài nguyên (số lượng request, dung lượng CSDL), có thể ảnh hưởng lúc kiểm thử tải hoặc demo đông người xem cùng lúc.</w:t>
             </w:r>
           </w:p>
         </w:tc>
@@ -4125,7 +4125,7 @@
                 <w:sz w:val="20"/>
                 <w:szCs w:val="20"/>
               </w:rPr>
-              <w:t xml:space="preserve">Đã xếp 2 tính năng này vào nhóm 'Nâng cao' (xem docs/Bang_tinh_nang.md) — không bắt buộc cho bản demo chính (MVP), có thể lược bớt nếu thiếu thời gian mà không ảnh hưởng các tính năng CRUD cốt lõi.</w:t>
+              <w:t xml:space="preserve">Đã xếp 2 tính năng này vào nhóm 'Nâng cao' (xem docs/Bang_tinh_nang.md), không bắt buộc cho bản demo chính (MVP), có thể lược bớt nếu thiếu thời gian mà không ảnh hưởng các tính năng CRUD cốt lõi.</w:t>
             </w:r>
           </w:p>
         </w:tc>
@@ -4223,7 +4223,7 @@
                 <w:sz w:val="20"/>
                 <w:szCs w:val="20"/>
               </w:rPr>
-              <w:t xml:space="preserve">Đã viết lại toàn bộ tài liệu kế hoạch (Gantt, phân công, bảng tính năng) ngay sau khi đổi ý tưởng, trước khi bắt đầu code tính năng — tránh lặp lại việc phải sửa tài liệu giữa chừng về sau.</w:t>
+              <w:t xml:space="preserve">Đã viết lại toàn bộ tài liệu kế hoạch (Gantt, phân công, bảng tính năng) ngay sau khi đổi ý tưởng, trước khi bắt đầu code tính năng. Việc này tránh phải sửa tài liệu giữa chừng về sau.</w:t>
             </w:r>
           </w:p>
         </w:tc>

</xml_diff>